<commit_message>
Align Evidence Lab with the 2026 ACRL Framework
</commit_message>
<xml_diff>
--- a/educators/Evidence_Lab_Teaching_Guide_v1.0.docx
+++ b/educators/Evidence_Lab_Teaching_Guide_v1.0.docx
@@ -391,7 +391,81 @@
         <w:pStyle w:val="Heading1"/>
       </w:pPr>
       <w:r>
-        <w:t>9. Accessibility and multimodal evidence</w:t>
+        <w:t>9. Alignment with the ACRL Framework (2026 revision)</w:t>
+      </w:r>
+    </w:p>
+    <w:p>
+      <w:pPr/>
+      <w:r>
+        <w:t>Evidence Lab is informed by and aligned with the ACRL Framework for Information Literacy for Higher Education, including revisions approved September 2, 2026. The game is not intended as a comprehensive implementation or assessment of every Framework knowledge practice or disposition. Coverage is intentionally uneven because cases are designed around authentic information problems rather than a six-frame quota.</w:t>
+      </w:r>
+    </w:p>
+    <w:p>
+      <w:pPr>
+        <w:pStyle w:val="ListBullet"/>
+      </w:pPr>
+      <w:r>
+        <w:t>Authority Is Constructed and Contextual — very strong: students evaluate expertise, credibility, incentives, institutional authority, and AI authority in context.</w:t>
+      </w:r>
+    </w:p>
+    <w:p>
+      <w:pPr>
+        <w:pStyle w:val="ListBullet"/>
+      </w:pPr>
+      <w:r>
+        <w:t>Information Creation as a Process — very strong: students trace how posts, images, clips, translations, summaries, citations, and other information products are created, transformed, and circulated.</w:t>
+      </w:r>
+    </w:p>
+    <w:p>
+      <w:pPr>
+        <w:pStyle w:val="ListBullet"/>
+      </w:pPr>
+      <w:r>
+        <w:t>Information Has Value — selective but meaningful: sponsorship, financial incentives, access barriers, money, personal information, attribution, and information exchange appear in relevant cases.</w:t>
+      </w:r>
+    </w:p>
+    <w:p>
+      <w:pPr>
+        <w:pStyle w:val="ListBullet"/>
+      </w:pPr>
+      <w:r>
+        <w:t>Research as Inquiry — very strong: students investigate uncertainty, identify gaps, gather evidence, update conclusions, and sometimes conclude that available evidence is insufficient.</w:t>
+      </w:r>
+    </w:p>
+    <w:p>
+      <w:pPr>
+        <w:pStyle w:val="ListBullet"/>
+      </w:pPr>
+      <w:r>
+        <w:t>Scholarship as Conversation — strong: students trace claims and citations, distinguish independent corroboration from repetition, and compare research findings with later representations.</w:t>
+      </w:r>
+    </w:p>
+    <w:p>
+      <w:pPr>
+        <w:pStyle w:val="ListBullet"/>
+      </w:pPr>
+      <w:r>
+        <w:t>Searching as Strategic Exploration — very strong: students choose what to check, trace sources laterally, use authoritative channels, revise search paths, and decide when evidence is sufficient.</w:t>
+      </w:r>
+    </w:p>
+    <w:p>
+      <w:pPr/>
+      <w:r>
+        <w:t>The 2026 revision is especially relevant to Evidence Lab because it explicitly addresses emerging technologies and AI, metacognition, evolving information creation processes, and critical evaluation of AI-mediated searching and authority.</w:t>
+      </w:r>
+    </w:p>
+    <w:p>
+      <w:pPr/>
+      <w:r>
+        <w:t>Framework reference: Association of College and Research Libraries. Framework for Information Literacy for Higher Education. Adopted 2016; revisions approved September 2, 2026.</w:t>
+      </w:r>
+    </w:p>
+    <w:p>
+      <w:pPr>
+        <w:pStyle w:val="Heading1"/>
+      </w:pPr>
+      <w:r>
+        <w:t>10. Accessibility and multimodal evidence</w:t>
       </w:r>
     </w:p>
     <w:p>
@@ -404,7 +478,7 @@
         <w:pStyle w:val="Heading1"/>
       </w:pPr>
       <w:r>
-        <w:t>10. Privacy and assessment</w:t>
+        <w:t>11. Privacy and assessment</w:t>
       </w:r>
     </w:p>
     <w:p>
@@ -417,7 +491,7 @@
         <w:pStyle w:val="Heading1"/>
       </w:pPr>
       <w:r>
-        <w:t>11. Reuse and localization</w:t>
+        <w:t>12. Reuse and localization</w:t>
       </w:r>
     </w:p>
     <w:p>
@@ -430,7 +504,7 @@
         <w:pStyle w:val="Heading1"/>
       </w:pPr>
       <w:r>
-        <w:t>12. Spoiler-free 36-case catalog</w:t>
+        <w:t>13. Spoiler-free 36-case catalog</w:t>
       </w:r>
     </w:p>
     <w:tbl>
@@ -2005,7 +2079,7 @@
         <w:pStyle w:val="Heading1"/>
       </w:pPr>
       <w:r>
-        <w:t>13. Public vs. confidential educator materials</w:t>
+        <w:t>14. Public vs. confidential educator materials</w:t>
       </w:r>
     </w:p>
     <w:p>
@@ -2018,7 +2092,7 @@
         <w:pStyle w:val="Heading1"/>
       </w:pPr>
       <w:r>
-        <w:t>14. Citation</w:t>
+        <w:t>15. Citation</w:t>
       </w:r>
     </w:p>
     <w:p>

</xml_diff>

<commit_message>
Add Zenodo DOI and citation metadata
</commit_message>
<xml_diff>
--- a/educators/Evidence_Lab_Teaching_Guide_v1.0.docx
+++ b/educators/Evidence_Lab_Teaching_Guide_v1.0.docx
@@ -2097,12 +2097,10 @@
     </w:p>
     <w:p>
       <w:r>
-        <w:t>Liu, Y. (2026). Evidence Lab: Follow the evidence. Make the call (Version 1.0) [Educational software]. https://yanlingliuinfolit.github.io/evidence-lab/</w:t>
-      </w:r>
-    </w:p>
-    <w:p>
-      <w:r>
-        <w:t>A DOI citation will be added after the Version 1.0 Zenodo archival release.</w:t>
+        <w:rPr>
+          <w:sz w:val="20"/>
+        </w:rPr>
+        <w:t>Liu, Y. (2026). Evidence Lab: An Information-Literacy Investigation Game (Version 1.0.0) [Computer software]. Zenodo. https://doi.org/10.5281/zenodo.23567784 Version 1.0.0 DOI: 10.5281/zenodo.23567784. All-versions DOI: 10.5281/zenodo.23567783.</w:t>
       </w:r>
     </w:p>
     <w:sectPr>

</xml_diff>